<commit_message>
update did 6 list almost end all subject
</commit_message>
<xml_diff>
--- a/Lab4 Sprawozdanie Franciszek Kalembkiewicz.docx
+++ b/Lab4 Sprawozdanie Franciszek Kalembkiewicz.docx
@@ -237,6 +237,9 @@
         </w:rPr>
       </w:pPr>
       <w:r>
+        <w:rPr>
+          <w:noProof/>
+        </w:rPr>
         <w:drawing>
           <wp:inline distT="0" distB="0" distL="0" distR="0" wp14:anchorId="25F9548F" wp14:editId="33BCCBD0">
             <wp:extent cx="5969635" cy="1349528"/>
@@ -326,6 +329,63 @@
     </w:p>
     <w:p>
       <w:pPr>
+        <w:spacing w:after="0"/>
+        <w:ind w:left="1416"/>
+        <w:rPr>
+          <w:sz w:val="28"/>
+          <w:szCs w:val="28"/>
+        </w:rPr>
+      </w:pPr>
+      <w:r>
+        <w:rPr>
+          <w:sz w:val="28"/>
+          <w:szCs w:val="28"/>
+        </w:rPr>
+        <w:t xml:space="preserve">PS. Dane </w:t>
+      </w:r>
+      <w:r>
+        <w:rPr>
+          <w:sz w:val="28"/>
+          <w:szCs w:val="28"/>
+        </w:rPr>
+        <w:t xml:space="preserve">zostały ograniczone do top 10 aktorów którzy mieli najwięcej </w:t>
+      </w:r>
+      <w:proofErr w:type="spellStart"/>
+      <w:r>
+        <w:rPr>
+          <w:sz w:val="28"/>
+          <w:szCs w:val="28"/>
+        </w:rPr>
+        <w:t>wystapien</w:t>
+      </w:r>
+      <w:proofErr w:type="spellEnd"/>
+      <w:r>
+        <w:rPr>
+          <w:sz w:val="28"/>
+          <w:szCs w:val="28"/>
+        </w:rPr>
+        <w:t xml:space="preserve"> w filmach</w:t>
+      </w:r>
+      <w:r>
+        <w:rPr>
+          <w:sz w:val="28"/>
+          <w:szCs w:val="28"/>
+        </w:rPr>
+        <w:t xml:space="preserve"> by utrzymać czytelność danych</w:t>
+      </w:r>
+    </w:p>
+    <w:p>
+      <w:pPr>
+        <w:spacing w:after="0"/>
+        <w:ind w:left="1416"/>
+        <w:rPr>
+          <w:sz w:val="28"/>
+          <w:szCs w:val="28"/>
+        </w:rPr>
+      </w:pPr>
+    </w:p>
+    <w:p>
+      <w:pPr>
         <w:pStyle w:val="Akapitzlist"/>
         <w:numPr>
           <w:ilvl w:val="1"/>
@@ -397,10 +457,10 @@
           <w:szCs w:val="28"/>
         </w:rPr>
         <w:drawing>
-          <wp:inline distT="0" distB="0" distL="0" distR="0" wp14:anchorId="42982D66" wp14:editId="29A048F8">
-            <wp:extent cx="6645910" cy="2779395"/>
-            <wp:effectExtent l="0" t="0" r="2540" b="1905"/>
-            <wp:docPr id="64277410" name="Obraz 1" descr="Obraz zawierający szkic, linia, sztuka, design&#10;&#10;Zawartość wygenerowana przez AI może być niepoprawna."/>
+          <wp:inline distT="0" distB="0" distL="0" distR="0" wp14:anchorId="67C50596" wp14:editId="0AE1B87C">
+            <wp:extent cx="6645910" cy="3394710"/>
+            <wp:effectExtent l="0" t="0" r="2540" b="0"/>
+            <wp:docPr id="1012413184" name="Obraz 1" descr="Obraz zawierający diagram, tekst, wzór&#10;&#10;Zawartość wygenerowana przez AI może być niepoprawna."/>
             <wp:cNvGraphicFramePr>
               <a:graphicFrameLocks xmlns:a="http://schemas.openxmlformats.org/drawingml/2006/main" noChangeAspect="1"/>
             </wp:cNvGraphicFramePr>
@@ -408,7 +468,7 @@
               <a:graphicData uri="http://schemas.openxmlformats.org/drawingml/2006/picture">
                 <pic:pic xmlns:pic="http://schemas.openxmlformats.org/drawingml/2006/picture">
                   <pic:nvPicPr>
-                    <pic:cNvPr id="64277410" name="Obraz 1" descr="Obraz zawierający szkic, linia, sztuka, design&#10;&#10;Zawartość wygenerowana przez AI może być niepoprawna."/>
+                    <pic:cNvPr id="1012413184" name="Obraz 1" descr="Obraz zawierający diagram, tekst, wzór&#10;&#10;Zawartość wygenerowana przez AI może być niepoprawna."/>
                     <pic:cNvPicPr/>
                   </pic:nvPicPr>
                   <pic:blipFill>
@@ -420,7 +480,7 @@
                   <pic:spPr>
                     <a:xfrm>
                       <a:off x="0" y="0"/>
-                      <a:ext cx="6645910" cy="2779395"/>
+                      <a:ext cx="6645910" cy="3394710"/>
                     </a:xfrm>
                     <a:prstGeom prst="rect">
                       <a:avLst/>
@@ -486,11 +546,42 @@
     <w:p>
       <w:pPr>
         <w:spacing w:after="0"/>
-        <w:rPr>
-          <w:sz w:val="28"/>
-          <w:szCs w:val="28"/>
-        </w:rPr>
-      </w:pPr>
+        <w:ind w:left="1416"/>
+        <w:rPr>
+          <w:sz w:val="28"/>
+          <w:szCs w:val="28"/>
+        </w:rPr>
+      </w:pPr>
+      <w:r>
+        <w:rPr>
+          <w:sz w:val="28"/>
+          <w:szCs w:val="28"/>
+        </w:rPr>
+        <w:t xml:space="preserve">Drugą wizualizacją jest </w:t>
+      </w:r>
+      <w:proofErr w:type="spellStart"/>
+      <w:r>
+        <w:rPr>
+          <w:sz w:val="28"/>
+          <w:szCs w:val="28"/>
+        </w:rPr>
+        <w:t>heatmapa</w:t>
+      </w:r>
+      <w:proofErr w:type="spellEnd"/>
+      <w:r>
+        <w:rPr>
+          <w:sz w:val="28"/>
+          <w:szCs w:val="28"/>
+        </w:rPr>
+        <w:t xml:space="preserve"> macierzy dwudzielnej czyli </w:t>
+      </w:r>
+      <w:r>
+        <w:rPr>
+          <w:sz w:val="28"/>
+          <w:szCs w:val="28"/>
+        </w:rPr>
+        <w:t>graficzna wizualizacja zwykłej macierzy gdzie zakolorowane pole oznacza 1</w:t>
+      </w:r>
     </w:p>
     <w:p>
       <w:pPr>
@@ -500,22 +591,62 @@
           <w:szCs w:val="28"/>
         </w:rPr>
       </w:pPr>
+      <w:r>
+        <w:rPr>
+          <w:sz w:val="28"/>
+          <w:szCs w:val="28"/>
+        </w:rPr>
+        <w:drawing>
+          <wp:inline distT="0" distB="0" distL="0" distR="0" wp14:anchorId="4641763A" wp14:editId="1BDE64C1">
+            <wp:extent cx="6645910" cy="3299460"/>
+            <wp:effectExtent l="0" t="0" r="2540" b="0"/>
+            <wp:docPr id="1100960244" name="Obraz 1" descr="Obraz zawierający tekst, zrzut ekranu, linia&#10;&#10;Zawartość wygenerowana przez AI może być niepoprawna."/>
+            <wp:cNvGraphicFramePr>
+              <a:graphicFrameLocks xmlns:a="http://schemas.openxmlformats.org/drawingml/2006/main" noChangeAspect="1"/>
+            </wp:cNvGraphicFramePr>
+            <a:graphic xmlns:a="http://schemas.openxmlformats.org/drawingml/2006/main">
+              <a:graphicData uri="http://schemas.openxmlformats.org/drawingml/2006/picture">
+                <pic:pic xmlns:pic="http://schemas.openxmlformats.org/drawingml/2006/picture">
+                  <pic:nvPicPr>
+                    <pic:cNvPr id="1100960244" name="Obraz 1" descr="Obraz zawierający tekst, zrzut ekranu, linia&#10;&#10;Zawartość wygenerowana przez AI może być niepoprawna."/>
+                    <pic:cNvPicPr/>
+                  </pic:nvPicPr>
+                  <pic:blipFill>
+                    <a:blip r:embed="rId7"/>
+                    <a:stretch>
+                      <a:fillRect/>
+                    </a:stretch>
+                  </pic:blipFill>
+                  <pic:spPr>
+                    <a:xfrm>
+                      <a:off x="0" y="0"/>
+                      <a:ext cx="6645910" cy="3299460"/>
+                    </a:xfrm>
+                    <a:prstGeom prst="rect">
+                      <a:avLst/>
+                    </a:prstGeom>
+                  </pic:spPr>
+                </pic:pic>
+              </a:graphicData>
+            </a:graphic>
+          </wp:inline>
+        </w:drawing>
+      </w:r>
     </w:p>
     <w:p>
       <w:pPr>
         <w:spacing w:after="0"/>
-        <w:ind w:left="708" w:firstLine="708"/>
-        <w:rPr>
-          <w:sz w:val="28"/>
-          <w:szCs w:val="28"/>
-        </w:rPr>
-      </w:pPr>
-      <w:r>
-        <w:rPr>
-          <w:sz w:val="28"/>
-          <w:szCs w:val="28"/>
-        </w:rPr>
-        <w:lastRenderedPageBreak/>
+        <w:ind w:left="1416"/>
+        <w:rPr>
+          <w:sz w:val="28"/>
+          <w:szCs w:val="28"/>
+        </w:rPr>
+      </w:pPr>
+      <w:r>
+        <w:rPr>
+          <w:sz w:val="28"/>
+          <w:szCs w:val="28"/>
+        </w:rPr>
         <w:t>Przedstawiłem to równie</w:t>
       </w:r>
       <w:r>
@@ -552,6 +683,20 @@
           <w:szCs w:val="28"/>
         </w:rPr>
         <w:t xml:space="preserve">siedztwa </w:t>
+      </w:r>
+      <w:r>
+        <w:rPr>
+          <w:sz w:val="28"/>
+          <w:szCs w:val="28"/>
+        </w:rPr>
+        <w:t>ale</w:t>
+      </w:r>
+      <w:r>
+        <w:rPr>
+          <w:sz w:val="28"/>
+          <w:szCs w:val="28"/>
+        </w:rPr>
+        <w:t xml:space="preserve"> w postaci prawdziwej macierzy</w:t>
       </w:r>
     </w:p>
     <w:p>
@@ -565,6 +710,7 @@
       </w:pPr>
       <w:r>
         <w:rPr>
+          <w:noProof/>
           <w:sz w:val="28"/>
           <w:szCs w:val="28"/>
         </w:rPr>
@@ -584,7 +730,7 @@
                     <pic:cNvPicPr/>
                   </pic:nvPicPr>
                   <pic:blipFill>
-                    <a:blip r:embed="rId7"/>
+                    <a:blip r:embed="rId8"/>
                     <a:stretch>
                       <a:fillRect/>
                     </a:stretch>
@@ -646,9 +792,11 @@
       </w:pPr>
       <w:r>
         <w:rPr>
-          <w:sz w:val="28"/>
-          <w:szCs w:val="28"/>
-        </w:rPr>
+          <w:noProof/>
+          <w:sz w:val="28"/>
+          <w:szCs w:val="28"/>
+        </w:rPr>
+        <w:lastRenderedPageBreak/>
         <w:drawing>
           <wp:inline distT="0" distB="0" distL="0" distR="0" wp14:anchorId="00A6CA04" wp14:editId="2A36CA12">
             <wp:extent cx="6645910" cy="1624965"/>
@@ -665,7 +813,7 @@
                     <pic:cNvPicPr/>
                   </pic:nvPicPr>
                   <pic:blipFill>
-                    <a:blip r:embed="rId8"/>
+                    <a:blip r:embed="rId9"/>
                     <a:stretch>
                       <a:fillRect/>
                     </a:stretch>

</xml_diff>

<commit_message>
hopefuly last update, this should end this course
</commit_message>
<xml_diff>
--- a/Lab4 Sprawozdanie Franciszek Kalembkiewicz.docx
+++ b/Lab4 Sprawozdanie Franciszek Kalembkiewicz.docx
@@ -179,6 +179,7 @@
           <w:numId w:val="1"/>
         </w:numPr>
         <w:spacing w:after="0"/>
+        <w:ind w:left="720"/>
         <w:rPr>
           <w:sz w:val="28"/>
           <w:szCs w:val="28"/>
@@ -214,6 +215,7 @@
           <w:numId w:val="1"/>
         </w:numPr>
         <w:spacing w:after="0"/>
+        <w:ind w:left="1440"/>
         <w:rPr>
           <w:sz w:val="28"/>
           <w:szCs w:val="28"/>
@@ -241,10 +243,10 @@
           <w:noProof/>
         </w:rPr>
         <w:drawing>
-          <wp:inline distT="0" distB="0" distL="0" distR="0" wp14:anchorId="25F9548F" wp14:editId="33BCCBD0">
+          <wp:inline distT="0" distB="0" distL="0" distR="0" wp14:anchorId="51F6C083" wp14:editId="2972EDDC">
             <wp:extent cx="5969635" cy="1349528"/>
             <wp:effectExtent l="0" t="0" r="0" b="3175"/>
-            <wp:docPr id="399192056" name="Obraz 1"/>
+            <wp:docPr id="399192056" name="Obraz 1" descr="Obraz zawierający zrzut ekranu, miejsce parkingowe/przestrzeń&#10;&#10;Zawartość wygenerowana przez AI może być niepoprawna."/>
             <wp:cNvGraphicFramePr>
               <a:graphicFrameLocks xmlns:a="http://schemas.openxmlformats.org/drawingml/2006/main" noChangeAspect="1"/>
             </wp:cNvGraphicFramePr>
@@ -252,7 +254,7 @@
               <a:graphicData uri="http://schemas.openxmlformats.org/drawingml/2006/picture">
                 <pic:pic xmlns:pic="http://schemas.openxmlformats.org/drawingml/2006/picture">
                   <pic:nvPicPr>
-                    <pic:cNvPr id="399192056" name="Obraz 1"/>
+                    <pic:cNvPr id="399192056" name="Obraz 1" descr="Obraz zawierający zrzut ekranu, miejsce parkingowe/przestrzeń&#10;&#10;Zawartość wygenerowana przez AI może być niepoprawna."/>
                     <pic:cNvPicPr/>
                   </pic:nvPicPr>
                   <pic:blipFill>
@@ -341,14 +343,7 @@
           <w:sz w:val="28"/>
           <w:szCs w:val="28"/>
         </w:rPr>
-        <w:t xml:space="preserve">PS. Dane </w:t>
-      </w:r>
-      <w:r>
-        <w:rPr>
-          <w:sz w:val="28"/>
-          <w:szCs w:val="28"/>
-        </w:rPr>
-        <w:t xml:space="preserve">zostały ograniczone do top 10 aktorów którzy mieli najwięcej </w:t>
+        <w:t xml:space="preserve">PS. Dane zostały ograniczone do top 10 aktorów którzy mieli najwięcej </w:t>
       </w:r>
       <w:proofErr w:type="spellStart"/>
       <w:r>
@@ -364,14 +359,7 @@
           <w:sz w:val="28"/>
           <w:szCs w:val="28"/>
         </w:rPr>
-        <w:t xml:space="preserve"> w filmach</w:t>
-      </w:r>
-      <w:r>
-        <w:rPr>
-          <w:sz w:val="28"/>
-          <w:szCs w:val="28"/>
-        </w:rPr>
-        <w:t xml:space="preserve"> by utrzymać czytelność danych</w:t>
+        <w:t xml:space="preserve"> w filmach by utrzymać czytelność danych</w:t>
       </w:r>
     </w:p>
     <w:p>
@@ -392,24 +380,18 @@
           <w:numId w:val="1"/>
         </w:numPr>
         <w:spacing w:after="0"/>
-        <w:rPr>
-          <w:sz w:val="28"/>
-          <w:szCs w:val="28"/>
-        </w:rPr>
-      </w:pPr>
-      <w:r>
-        <w:rPr>
-          <w:sz w:val="28"/>
-          <w:szCs w:val="28"/>
-        </w:rPr>
-        <w:t xml:space="preserve">Do przedstawienia zastosowałem </w:t>
-      </w:r>
-      <w:r>
-        <w:rPr>
-          <w:sz w:val="28"/>
-          <w:szCs w:val="28"/>
-        </w:rPr>
-        <w:t xml:space="preserve">biblioteki </w:t>
+        <w:ind w:left="1440"/>
+        <w:rPr>
+          <w:sz w:val="28"/>
+          <w:szCs w:val="28"/>
+        </w:rPr>
+      </w:pPr>
+      <w:r>
+        <w:rPr>
+          <w:sz w:val="28"/>
+          <w:szCs w:val="28"/>
+        </w:rPr>
+        <w:t xml:space="preserve">Do przedstawienia zastosowałem biblioteki </w:t>
       </w:r>
       <w:proofErr w:type="spellStart"/>
       <w:r>
@@ -425,21 +407,7 @@
           <w:sz w:val="28"/>
           <w:szCs w:val="28"/>
         </w:rPr>
-        <w:t xml:space="preserve"> gdzie jedne dane pokolorowałem na czerwono jako filmy a drugi na niebiesko</w:t>
-      </w:r>
-      <w:r>
-        <w:rPr>
-          <w:sz w:val="28"/>
-          <w:szCs w:val="28"/>
-        </w:rPr>
-        <w:t xml:space="preserve"> aktorów i</w:t>
-      </w:r>
-      <w:r>
-        <w:rPr>
-          <w:sz w:val="28"/>
-          <w:szCs w:val="28"/>
-        </w:rPr>
-        <w:t xml:space="preserve"> możemy zobaczyć którzy aktorzy grali w których filmach</w:t>
+        <w:t xml:space="preserve"> gdzie jedne dane pokolorowałem na czerwono jako filmy a drugi na niebiesko aktorów i możemy zobaczyć którzy aktorzy grali w których filmach</w:t>
       </w:r>
     </w:p>
     <w:p>
@@ -453,11 +421,12 @@
       </w:pPr>
       <w:r>
         <w:rPr>
+          <w:noProof/>
           <w:sz w:val="28"/>
           <w:szCs w:val="28"/>
         </w:rPr>
         <w:drawing>
-          <wp:inline distT="0" distB="0" distL="0" distR="0" wp14:anchorId="67C50596" wp14:editId="0AE1B87C">
+          <wp:inline distT="0" distB="0" distL="0" distR="0" wp14:anchorId="11ADF9D9" wp14:editId="5A56B0D5">
             <wp:extent cx="6645910" cy="3394710"/>
             <wp:effectExtent l="0" t="0" r="2540" b="0"/>
             <wp:docPr id="1012413184" name="Obraz 1" descr="Obraz zawierający diagram, tekst, wzór&#10;&#10;Zawartość wygenerowana przez AI może być niepoprawna."/>
@@ -573,14 +542,7 @@
           <w:sz w:val="28"/>
           <w:szCs w:val="28"/>
         </w:rPr>
-        <w:t xml:space="preserve"> macierzy dwudzielnej czyli </w:t>
-      </w:r>
-      <w:r>
-        <w:rPr>
-          <w:sz w:val="28"/>
-          <w:szCs w:val="28"/>
-        </w:rPr>
-        <w:t>graficzna wizualizacja zwykłej macierzy gdzie zakolorowane pole oznacza 1</w:t>
+        <w:t xml:space="preserve"> macierzy dwudzielnej czyli graficzna wizualizacja zwykłej macierzy gdzie zakolorowane pole oznacza 1</w:t>
       </w:r>
     </w:p>
     <w:p>
@@ -593,11 +555,12 @@
       </w:pPr>
       <w:r>
         <w:rPr>
+          <w:noProof/>
           <w:sz w:val="28"/>
           <w:szCs w:val="28"/>
         </w:rPr>
         <w:drawing>
-          <wp:inline distT="0" distB="0" distL="0" distR="0" wp14:anchorId="4641763A" wp14:editId="1BDE64C1">
+          <wp:inline distT="0" distB="0" distL="0" distR="0" wp14:anchorId="4ACAB24C" wp14:editId="5D26DC0F">
             <wp:extent cx="6645910" cy="3299460"/>
             <wp:effectExtent l="0" t="0" r="2540" b="0"/>
             <wp:docPr id="1100960244" name="Obraz 1" descr="Obraz zawierający tekst, zrzut ekranu, linia&#10;&#10;Zawartość wygenerowana przez AI może być niepoprawna."/>
@@ -647,56 +610,7 @@
           <w:sz w:val="28"/>
           <w:szCs w:val="28"/>
         </w:rPr>
-        <w:t>Przedstawiłem to równie</w:t>
-      </w:r>
-      <w:r>
-        <w:rPr>
-          <w:sz w:val="28"/>
-          <w:szCs w:val="28"/>
-        </w:rPr>
-        <w:t>ż</w:t>
-      </w:r>
-      <w:r>
-        <w:rPr>
-          <w:sz w:val="28"/>
-          <w:szCs w:val="28"/>
-        </w:rPr>
-        <w:t xml:space="preserve"> w postaci macierzy </w:t>
-      </w:r>
-      <w:r>
-        <w:rPr>
-          <w:sz w:val="28"/>
-          <w:szCs w:val="28"/>
-        </w:rPr>
-        <w:t>s</w:t>
-      </w:r>
-      <w:r>
-        <w:rPr>
-          <w:sz w:val="28"/>
-          <w:szCs w:val="28"/>
-        </w:rPr>
-        <w:t>ą</w:t>
-      </w:r>
-      <w:r>
-        <w:rPr>
-          <w:sz w:val="28"/>
-          <w:szCs w:val="28"/>
-        </w:rPr>
-        <w:t xml:space="preserve">siedztwa </w:t>
-      </w:r>
-      <w:r>
-        <w:rPr>
-          <w:sz w:val="28"/>
-          <w:szCs w:val="28"/>
-        </w:rPr>
-        <w:t>ale</w:t>
-      </w:r>
-      <w:r>
-        <w:rPr>
-          <w:sz w:val="28"/>
-          <w:szCs w:val="28"/>
-        </w:rPr>
-        <w:t xml:space="preserve"> w postaci prawdziwej macierzy</w:t>
+        <w:t>Przedstawiłem to również w postaci macierzy sąsiedztwa ale w postaci prawdziwej macierzy</w:t>
       </w:r>
     </w:p>
     <w:p>
@@ -715,10 +629,10 @@
           <w:szCs w:val="28"/>
         </w:rPr>
         <w:drawing>
-          <wp:inline distT="0" distB="0" distL="0" distR="0" wp14:anchorId="1CEE067A" wp14:editId="68ECD9F8">
+          <wp:inline distT="0" distB="0" distL="0" distR="0" wp14:anchorId="36D50C1C" wp14:editId="391BEA16">
             <wp:extent cx="6645910" cy="4083685"/>
             <wp:effectExtent l="0" t="0" r="2540" b="0"/>
-            <wp:docPr id="1703556348" name="Obraz 1"/>
+            <wp:docPr id="1703556348" name="Obraz 1" descr="Obraz zawierający tekst, zrzut ekranu&#10;&#10;Zawartość wygenerowana przez AI może być niepoprawna."/>
             <wp:cNvGraphicFramePr>
               <a:graphicFrameLocks xmlns:a="http://schemas.openxmlformats.org/drawingml/2006/main" noChangeAspect="1"/>
             </wp:cNvGraphicFramePr>
@@ -726,7 +640,7 @@
               <a:graphicData uri="http://schemas.openxmlformats.org/drawingml/2006/picture">
                 <pic:pic xmlns:pic="http://schemas.openxmlformats.org/drawingml/2006/picture">
                   <pic:nvPicPr>
-                    <pic:cNvPr id="1703556348" name=""/>
+                    <pic:cNvPr id="1703556348" name="Obraz 1" descr="Obraz zawierający tekst, zrzut ekranu&#10;&#10;Zawartość wygenerowana przez AI może być niepoprawna."/>
                     <pic:cNvPicPr/>
                   </pic:nvPicPr>
                   <pic:blipFill>
@@ -765,21 +679,7 @@
           <w:sz w:val="28"/>
           <w:szCs w:val="28"/>
         </w:rPr>
-        <w:t xml:space="preserve">Jak i również </w:t>
-      </w:r>
-      <w:r>
-        <w:rPr>
-          <w:sz w:val="28"/>
-          <w:szCs w:val="28"/>
-        </w:rPr>
-        <w:t xml:space="preserve">macierzy dwudzielnej gdzie na kolumnie są filmy a na wierszach </w:t>
-      </w:r>
-      <w:r>
-        <w:rPr>
-          <w:sz w:val="28"/>
-          <w:szCs w:val="28"/>
-        </w:rPr>
-        <w:t>aktorzy i jedynka oznacza ich połączenie</w:t>
+        <w:t>Jak i również macierzy dwudzielnej gdzie na kolumnie są filmy a na wierszach aktorzy i jedynka oznacza ich połączenie</w:t>
       </w:r>
     </w:p>
     <w:p>
@@ -798,7 +698,7 @@
         </w:rPr>
         <w:lastRenderedPageBreak/>
         <w:drawing>
-          <wp:inline distT="0" distB="0" distL="0" distR="0" wp14:anchorId="00A6CA04" wp14:editId="2A36CA12">
+          <wp:inline distT="0" distB="0" distL="0" distR="0" wp14:anchorId="3F3AFA07" wp14:editId="5496A87F">
             <wp:extent cx="6645910" cy="1624965"/>
             <wp:effectExtent l="0" t="0" r="2540" b="0"/>
             <wp:docPr id="278364759" name="Obraz 1" descr="Obraz zawierający zrzut ekranu&#10;&#10;Zawartość wygenerowana przez AI może być niepoprawna."/>
@@ -834,6 +734,7 @@
         </w:drawing>
       </w:r>
     </w:p>
+    <w:p/>
     <w:sectPr>
       <w:pgSz w:w="11906" w:h="16838"/>
       <w:pgMar w:top="720" w:right="720" w:bottom="720" w:left="720" w:header="708" w:footer="708" w:gutter="0"/>
@@ -849,14 +750,14 @@
   <w:abstractNum w:abstractNumId="0" w15:restartNumberingAfterBreak="0">
     <w:nsid w:val="472B7401"/>
     <w:multiLevelType w:val="hybridMultilevel"/>
-    <w:tmpl w:val="51767D52"/>
+    <w:tmpl w:val="3D707E14"/>
     <w:lvl w:ilvl="0" w:tplc="0415000F">
       <w:start w:val="1"/>
       <w:numFmt w:val="decimal"/>
       <w:lvlText w:val="%1."/>
       <w:lvlJc w:val="left"/>
       <w:pPr>
-        <w:ind w:left="720" w:hanging="360"/>
+        <w:ind w:left="1068" w:hanging="360"/>
       </w:pPr>
     </w:lvl>
     <w:lvl w:ilvl="1" w:tplc="04150019">
@@ -865,7 +766,7 @@
       <w:lvlText w:val="%2."/>
       <w:lvlJc w:val="left"/>
       <w:pPr>
-        <w:ind w:left="1440" w:hanging="360"/>
+        <w:ind w:left="1788" w:hanging="360"/>
       </w:pPr>
     </w:lvl>
     <w:lvl w:ilvl="2" w:tplc="0415001B">
@@ -874,7 +775,7 @@
       <w:lvlText w:val="%3."/>
       <w:lvlJc w:val="right"/>
       <w:pPr>
-        <w:ind w:left="2160" w:hanging="180"/>
+        <w:ind w:left="2508" w:hanging="180"/>
       </w:pPr>
     </w:lvl>
     <w:lvl w:ilvl="3" w:tplc="0415000F" w:tentative="1">
@@ -883,7 +784,7 @@
       <w:lvlText w:val="%4."/>
       <w:lvlJc w:val="left"/>
       <w:pPr>
-        <w:ind w:left="2880" w:hanging="360"/>
+        <w:ind w:left="3228" w:hanging="360"/>
       </w:pPr>
     </w:lvl>
     <w:lvl w:ilvl="4" w:tplc="04150019" w:tentative="1">
@@ -892,7 +793,7 @@
       <w:lvlText w:val="%5."/>
       <w:lvlJc w:val="left"/>
       <w:pPr>
-        <w:ind w:left="3600" w:hanging="360"/>
+        <w:ind w:left="3948" w:hanging="360"/>
       </w:pPr>
     </w:lvl>
     <w:lvl w:ilvl="5" w:tplc="0415001B" w:tentative="1">
@@ -901,7 +802,7 @@
       <w:lvlText w:val="%6."/>
       <w:lvlJc w:val="right"/>
       <w:pPr>
-        <w:ind w:left="4320" w:hanging="180"/>
+        <w:ind w:left="4668" w:hanging="180"/>
       </w:pPr>
     </w:lvl>
     <w:lvl w:ilvl="6" w:tplc="0415000F" w:tentative="1">
@@ -910,7 +811,7 @@
       <w:lvlText w:val="%7."/>
       <w:lvlJc w:val="left"/>
       <w:pPr>
-        <w:ind w:left="5040" w:hanging="360"/>
+        <w:ind w:left="5388" w:hanging="360"/>
       </w:pPr>
     </w:lvl>
     <w:lvl w:ilvl="7" w:tplc="04150019" w:tentative="1">
@@ -919,7 +820,7 @@
       <w:lvlText w:val="%8."/>
       <w:lvlJc w:val="left"/>
       <w:pPr>
-        <w:ind w:left="5760" w:hanging="360"/>
+        <w:ind w:left="6108" w:hanging="360"/>
       </w:pPr>
     </w:lvl>
     <w:lvl w:ilvl="8" w:tplc="0415001B" w:tentative="1">
@@ -928,12 +829,164 @@
       <w:lvlText w:val="%9."/>
       <w:lvlJc w:val="right"/>
       <w:pPr>
-        <w:ind w:left="6480" w:hanging="180"/>
-      </w:pPr>
+        <w:ind w:left="6828" w:hanging="180"/>
+      </w:pPr>
+    </w:lvl>
+  </w:abstractNum>
+  <w:abstractNum w:abstractNumId="1" w15:restartNumberingAfterBreak="0">
+    <w:nsid w:val="7F702D54"/>
+    <w:multiLevelType w:val="multilevel"/>
+    <w:tmpl w:val="3F18F9A2"/>
+    <w:lvl w:ilvl="0">
+      <w:start w:val="1"/>
+      <w:numFmt w:val="bullet"/>
+      <w:lvlText w:val=""/>
+      <w:lvlJc w:val="left"/>
+      <w:pPr>
+        <w:tabs>
+          <w:tab w:val="num" w:pos="720"/>
+        </w:tabs>
+        <w:ind w:left="720" w:hanging="360"/>
+      </w:pPr>
+      <w:rPr>
+        <w:rFonts w:ascii="Symbol" w:hAnsi="Symbol" w:hint="default"/>
+        <w:sz w:val="20"/>
+      </w:rPr>
+    </w:lvl>
+    <w:lvl w:ilvl="1" w:tentative="1">
+      <w:start w:val="1"/>
+      <w:numFmt w:val="bullet"/>
+      <w:lvlText w:val="o"/>
+      <w:lvlJc w:val="left"/>
+      <w:pPr>
+        <w:tabs>
+          <w:tab w:val="num" w:pos="1440"/>
+        </w:tabs>
+        <w:ind w:left="1440" w:hanging="360"/>
+      </w:pPr>
+      <w:rPr>
+        <w:rFonts w:ascii="Courier New" w:hAnsi="Courier New" w:hint="default"/>
+        <w:sz w:val="20"/>
+      </w:rPr>
+    </w:lvl>
+    <w:lvl w:ilvl="2" w:tentative="1">
+      <w:start w:val="1"/>
+      <w:numFmt w:val="bullet"/>
+      <w:lvlText w:val=""/>
+      <w:lvlJc w:val="left"/>
+      <w:pPr>
+        <w:tabs>
+          <w:tab w:val="num" w:pos="2160"/>
+        </w:tabs>
+        <w:ind w:left="2160" w:hanging="360"/>
+      </w:pPr>
+      <w:rPr>
+        <w:rFonts w:ascii="Wingdings" w:hAnsi="Wingdings" w:hint="default"/>
+        <w:sz w:val="20"/>
+      </w:rPr>
+    </w:lvl>
+    <w:lvl w:ilvl="3" w:tentative="1">
+      <w:start w:val="1"/>
+      <w:numFmt w:val="bullet"/>
+      <w:lvlText w:val=""/>
+      <w:lvlJc w:val="left"/>
+      <w:pPr>
+        <w:tabs>
+          <w:tab w:val="num" w:pos="2880"/>
+        </w:tabs>
+        <w:ind w:left="2880" w:hanging="360"/>
+      </w:pPr>
+      <w:rPr>
+        <w:rFonts w:ascii="Wingdings" w:hAnsi="Wingdings" w:hint="default"/>
+        <w:sz w:val="20"/>
+      </w:rPr>
+    </w:lvl>
+    <w:lvl w:ilvl="4" w:tentative="1">
+      <w:start w:val="1"/>
+      <w:numFmt w:val="bullet"/>
+      <w:lvlText w:val=""/>
+      <w:lvlJc w:val="left"/>
+      <w:pPr>
+        <w:tabs>
+          <w:tab w:val="num" w:pos="3600"/>
+        </w:tabs>
+        <w:ind w:left="3600" w:hanging="360"/>
+      </w:pPr>
+      <w:rPr>
+        <w:rFonts w:ascii="Wingdings" w:hAnsi="Wingdings" w:hint="default"/>
+        <w:sz w:val="20"/>
+      </w:rPr>
+    </w:lvl>
+    <w:lvl w:ilvl="5" w:tentative="1">
+      <w:start w:val="1"/>
+      <w:numFmt w:val="bullet"/>
+      <w:lvlText w:val=""/>
+      <w:lvlJc w:val="left"/>
+      <w:pPr>
+        <w:tabs>
+          <w:tab w:val="num" w:pos="4320"/>
+        </w:tabs>
+        <w:ind w:left="4320" w:hanging="360"/>
+      </w:pPr>
+      <w:rPr>
+        <w:rFonts w:ascii="Wingdings" w:hAnsi="Wingdings" w:hint="default"/>
+        <w:sz w:val="20"/>
+      </w:rPr>
+    </w:lvl>
+    <w:lvl w:ilvl="6" w:tentative="1">
+      <w:start w:val="1"/>
+      <w:numFmt w:val="bullet"/>
+      <w:lvlText w:val=""/>
+      <w:lvlJc w:val="left"/>
+      <w:pPr>
+        <w:tabs>
+          <w:tab w:val="num" w:pos="5040"/>
+        </w:tabs>
+        <w:ind w:left="5040" w:hanging="360"/>
+      </w:pPr>
+      <w:rPr>
+        <w:rFonts w:ascii="Wingdings" w:hAnsi="Wingdings" w:hint="default"/>
+        <w:sz w:val="20"/>
+      </w:rPr>
+    </w:lvl>
+    <w:lvl w:ilvl="7" w:tentative="1">
+      <w:start w:val="1"/>
+      <w:numFmt w:val="bullet"/>
+      <w:lvlText w:val=""/>
+      <w:lvlJc w:val="left"/>
+      <w:pPr>
+        <w:tabs>
+          <w:tab w:val="num" w:pos="5760"/>
+        </w:tabs>
+        <w:ind w:left="5760" w:hanging="360"/>
+      </w:pPr>
+      <w:rPr>
+        <w:rFonts w:ascii="Wingdings" w:hAnsi="Wingdings" w:hint="default"/>
+        <w:sz w:val="20"/>
+      </w:rPr>
+    </w:lvl>
+    <w:lvl w:ilvl="8" w:tentative="1">
+      <w:start w:val="1"/>
+      <w:numFmt w:val="bullet"/>
+      <w:lvlText w:val=""/>
+      <w:lvlJc w:val="left"/>
+      <w:pPr>
+        <w:tabs>
+          <w:tab w:val="num" w:pos="6480"/>
+        </w:tabs>
+        <w:ind w:left="6480" w:hanging="360"/>
+      </w:pPr>
+      <w:rPr>
+        <w:rFonts w:ascii="Wingdings" w:hAnsi="Wingdings" w:hint="default"/>
+        <w:sz w:val="20"/>
+      </w:rPr>
     </w:lvl>
   </w:abstractNum>
   <w:num w:numId="1" w16cid:durableId="1215192822">
     <w:abstractNumId w:val="0"/>
+  </w:num>
+  <w:num w:numId="2" w16cid:durableId="639304348">
+    <w:abstractNumId w:val="1"/>
   </w:num>
 </w:numbering>
 </file>

</xml_diff>